<commit_message>
Eskolako formatua: Izarraitz logoa eta PARA itxura
Paisaia A4, izenburu gris mugatua, ariketa-kutxak eta logo ofiziala.
Edukiak erabiltzailearen azken PDF bertsioan oinarrituta.

Co-authored-by: jazkune-izarraitz <jazkune-izarraitz@users.noreply.github.com>
</commit_message>
<xml_diff>
--- a/bukleak-bizitza-erreala/Bukleak_bizitza_errealean_ariketak.docx
+++ b/bukleak-bizitza-erreala/Bukleak_bizitza_errealean_ariketak.docx
@@ -3,117 +3,39 @@
 <w:document xmlns:wpc="http://schemas.microsoft.com/office/word/2010/wordprocessingCanvas" xmlns:mo="http://schemas.microsoft.com/office/mac/office/2008/main" xmlns:mc="http://schemas.openxmlformats.org/markup-compatibility/2006" xmlns:mv="urn:schemas-microsoft-com:mac:vml" xmlns:o="urn:schemas-microsoft-com:office:office" xmlns:r="http://schemas.openxmlformats.org/officeDocument/2006/relationships" xmlns:m="http://schemas.openxmlformats.org/officeDocument/2006/math" xmlns:v="urn:schemas-microsoft-com:vml" xmlns:wp14="http://schemas.microsoft.com/office/word/2010/wordprocessingDrawing" xmlns:wp="http://schemas.openxmlformats.org/drawingml/2006/wordprocessingDrawing" xmlns:w10="urn:schemas-microsoft-com:office:word" xmlns:w="http://schemas.openxmlformats.org/wordprocessingml/2006/main" xmlns:w14="http://schemas.microsoft.com/office/word/2010/wordml" xmlns:wpg="http://schemas.microsoft.com/office/word/2010/wordprocessingGroup" xmlns:wpi="http://schemas.microsoft.com/office/word/2010/wordprocessingInk" xmlns:wne="http://schemas.microsoft.com/office/word/2006/wordml" xmlns:wps="http://schemas.microsoft.com/office/word/2010/wordprocessingShape" mc:Ignorable="w14 wp14">
   <w:body>
     <w:p>
-      <w:pPr>
-        <w:spacing w:after="120"/>
-        <w:jc w:val="left"/>
-      </w:pPr>
       <w:r>
-        <w:rPr>
-          <w:rFonts w:ascii="Calibri" w:hAnsi="Calibri"/>
-          <w:b/>
-          <w:i w:val="0"/>
-          <w:color w:val="0D6E6E"/>
-          <w:sz w:val="40"/>
-        </w:rPr>
-        <w:t>Bukleak bizitza errealean</w:t>
-      </w:r>
-    </w:p>
-    <w:p>
-      <w:pPr>
-        <w:spacing w:after="160"/>
-      </w:pPr>
-      <w:r>
-        <w:rPr>
-          <w:rFonts w:ascii="Calibri" w:hAnsi="Calibri"/>
-          <w:b w:val="0"/>
-          <w:i w:val="0"/>
-          <w:color w:val="4A5568"/>
-          <w:sz w:val="20"/>
-        </w:rPr>
-        <w:t>Ariketa praktikoak · Pseint · PARA / MIENTRAS / REPETIR</w:t>
-      </w:r>
-    </w:p>
-    <w:p>
-      <w:pPr>
-        <w:spacing w:after="240"/>
-      </w:pPr>
-      <w:r>
-        <w:rPr>
-          <w:rFonts w:ascii="Calibri" w:hAnsi="Calibri"/>
-          <w:b w:val="0"/>
-          <w:i w:val="0"/>
-          <w:sz w:val="22"/>
-        </w:rPr>
-        <w:t>Problema bakoitzak eguneroko edo eskolako testuinguru bat du. Irakurri enuntziatua, erabaki zein bukle komeni den (</w:t>
-      </w:r>
-      <w:r>
-        <w:rPr>
-          <w:rFonts w:ascii="Calibri" w:hAnsi="Calibri"/>
-          <w:b/>
-          <w:i w:val="0"/>
-          <w:sz w:val="22"/>
-        </w:rPr>
-        <w:t>PARA</w:t>
-      </w:r>
-      <w:r>
-        <w:rPr>
-          <w:rFonts w:ascii="Calibri" w:hAnsi="Calibri"/>
-          <w:b w:val="0"/>
-          <w:i w:val="0"/>
-          <w:sz w:val="22"/>
-        </w:rPr>
-        <w:t xml:space="preserve">, </w:t>
-      </w:r>
-      <w:r>
-        <w:rPr>
-          <w:rFonts w:ascii="Calibri" w:hAnsi="Calibri"/>
-          <w:b/>
-          <w:i w:val="0"/>
-          <w:sz w:val="22"/>
-        </w:rPr>
-        <w:t>MIENTRAS</w:t>
-      </w:r>
-      <w:r>
-        <w:rPr>
-          <w:rFonts w:ascii="Calibri" w:hAnsi="Calibri"/>
-          <w:b w:val="0"/>
-          <w:i w:val="0"/>
-          <w:sz w:val="22"/>
-        </w:rPr>
-        <w:t xml:space="preserve"> edo </w:t>
-      </w:r>
-      <w:r>
-        <w:rPr>
-          <w:rFonts w:ascii="Calibri" w:hAnsi="Calibri"/>
-          <w:b/>
-          <w:i w:val="0"/>
-          <w:sz w:val="22"/>
-        </w:rPr>
-        <w:t>REPETIR</w:t>
-      </w:r>
-      <w:r>
-        <w:rPr>
-          <w:rFonts w:ascii="Calibri" w:hAnsi="Calibri"/>
-          <w:b w:val="0"/>
-          <w:i w:val="0"/>
-          <w:sz w:val="22"/>
-        </w:rPr>
-        <w:t>) eta ebatzi Pseint-en edo fluxu-diagraman.</w:t>
-      </w:r>
-    </w:p>
-    <w:p>
-      <w:pPr>
-        <w:spacing w:before="320" w:after="80"/>
-      </w:pPr>
-      <w:r>
-        <w:rPr>
-          <w:rFonts w:ascii="Calibri" w:hAnsi="Calibri"/>
-          <w:b/>
-          <w:i w:val="0"/>
-          <w:color w:val="1A2332"/>
-          <w:sz w:val="28"/>
-        </w:rPr>
-        <w:t>A. PARA buklea</w:t>
+        <w:drawing>
+          <wp:inline xmlns:a="http://schemas.openxmlformats.org/drawingml/2006/main" xmlns:pic="http://schemas.openxmlformats.org/drawingml/2006/picture">
+            <wp:extent cx="1512000" cy="438545"/>
+            <wp:docPr id="1" name="Picture 1"/>
+            <wp:cNvGraphicFramePr>
+              <a:graphicFrameLocks noChangeAspect="1"/>
+            </wp:cNvGraphicFramePr>
+            <a:graphic>
+              <a:graphicData uri="http://schemas.openxmlformats.org/drawingml/2006/picture">
+                <pic:pic>
+                  <pic:nvPicPr>
+                    <pic:cNvPr id="0" name="izarraitz-logoa.png"/>
+                    <pic:cNvPicPr/>
+                  </pic:nvPicPr>
+                  <pic:blipFill>
+                    <a:blip r:embed="rId9"/>
+                    <a:stretch>
+                      <a:fillRect/>
+                    </a:stretch>
+                  </pic:blipFill>
+                  <pic:spPr>
+                    <a:xfrm>
+                      <a:off x="0" y="0"/>
+                      <a:ext cx="1512000" cy="438545"/>
+                    </a:xfrm>
+                    <a:prstGeom prst="rect"/>
+                  </pic:spPr>
+                </pic:pic>
+              </a:graphicData>
+            </a:graphic>
+          </wp:inline>
+        </w:drawing>
       </w:r>
     </w:p>
     <w:p>
@@ -122,13 +44,39 @@
       </w:pPr>
       <w:r>
         <w:rPr>
-          <w:rFonts w:ascii="Calibri" w:hAnsi="Calibri"/>
-          <w:b w:val="0"/>
-          <w:i/>
-          <w:color w:val="4A5568"/>
+          <w:b/>
+          <w:color w:val="1A4A6E"/>
+          <w:sz w:val="18"/>
+        </w:rPr>
+        <w:t>IZARRAITZ Lanbide Heziketa  ·  Garapen-inguruneak · Pseint · Bukleak</w:t>
+      </w:r>
+    </w:p>
+    <w:p>
+      <w:pPr>
+        <w:spacing w:after="160"/>
+        <w:jc w:val="center"/>
+        <w:shd w:fill="D9D9D9" w:val="clear"/>
+        <w:pBdr>
+          <w:top w:val="single" w:sz="12" w:space="4" w:color="222222"/>
+          <w:left w:val="single" w:sz="12" w:space="4" w:color="222222"/>
+          <w:bottom w:val="single" w:sz="12" w:space="4" w:color="222222"/>
+          <w:right w:val="single" w:sz="12" w:space="4" w:color="222222"/>
+        </w:pBdr>
+      </w:pPr>
+      <w:r>
+        <w:rPr>
+          <w:b/>
+          <w:sz w:val="28"/>
+        </w:rPr>
+        <w:t>Bukleak bizitza errealean – ariketa praktikoak</w:t>
+      </w:r>
+    </w:p>
+    <w:p>
+      <w:r>
+        <w:rPr>
           <w:sz w:val="20"/>
         </w:rPr>
-        <w:t>Errepikapen kopurua aldez aurretik dakizunean. Goraka edo beheraka.</w:t>
+        <w:t>Problema bakoitzak eguneroko edo eskolako testuinguru bat du. Irakurri enuntziatua, erabaki zein bukle komeni den (PARA, MIENTRAS edo REPETIR) eta ebatzi Pseint-en edo fluxu-diagraman.</w:t>
       </w:r>
     </w:p>
     <w:p>
@@ -137,54 +85,23 @@
       </w:pPr>
       <w:r>
         <w:rPr>
-          <w:rFonts w:ascii="Calibri" w:hAnsi="Calibri"/>
           <w:b/>
-          <w:i w:val="0"/>
-          <w:sz w:val="22"/>
+          <w:color w:val="1A4A6E"/>
+          <w:sz w:val="24"/>
         </w:rPr>
-        <w:t xml:space="preserve">A1. Klaseko asistentzia  </w:t>
-      </w:r>
-      <w:r>
-        <w:rPr>
-          <w:rFonts w:ascii="Calibri" w:hAnsi="Calibri"/>
-          <w:b w:val="0"/>
-          <w:i/>
-          <w:color w:val="0D6E6E"/>
-          <w:sz w:val="18"/>
-        </w:rPr>
-        <w:t>[PARA]</w:t>
+        <w:t>A. PARA buklea</w:t>
       </w:r>
     </w:p>
     <w:p>
       <w:pPr>
-        <w:spacing w:after="80"/>
+        <w:spacing w:before="120" w:after="40"/>
       </w:pPr>
       <w:r>
         <w:rPr>
-          <w:rFonts w:ascii="Calibri" w:hAnsi="Calibri"/>
-          <w:b w:val="0"/>
-          <w:i w:val="0"/>
-          <w:sz w:val="22"/>
+          <w:b/>
+          <w:sz w:val="20"/>
         </w:rPr>
-        <w:t xml:space="preserve">Irakasleak astean zehar 5 egunetan ikasle kopurua jaso nahi du. Programa batek egun bakoitzean (1etik 5era) zenbat ikasle etorri diren galdetuko du eta amaieran </w:t>
-      </w:r>
-      <w:r>
-        <w:rPr>
-          <w:rFonts w:ascii="Calibri" w:hAnsi="Calibri"/>
-          <w:b/>
-          <w:i w:val="0"/>
-          <w:sz w:val="22"/>
-        </w:rPr>
-        <w:t>asteko asistentzia osoa</w:t>
-      </w:r>
-      <w:r>
-        <w:rPr>
-          <w:rFonts w:ascii="Calibri" w:hAnsi="Calibri"/>
-          <w:b w:val="0"/>
-          <w:i w:val="0"/>
-          <w:sz w:val="22"/>
-        </w:rPr>
-        <w:t xml:space="preserve"> erakutsiko du.</w:t>
+        <w:t>A1. Klaseko asistentzia</w:t>
       </w:r>
     </w:p>
     <w:p>
@@ -193,11 +110,16 @@
       </w:pPr>
       <w:r>
         <w:rPr>
-          <w:rFonts w:ascii="Calibri" w:hAnsi="Calibri"/>
+          <w:sz w:val="18"/>
+        </w:rPr>
+        <w:t>Irakasleak astean zehar 5 egunetan ikasle kopurua jaso nahi du. Programa batek egun bakoitzean (1etik 5era) zenbat ikasle etorri diren galdetuko du eta amaieran asteko asistentzia osoa erakutsiko du. Ikasle kopuru totala ere galdetu egin beharko du.</w:t>
+      </w:r>
+    </w:p>
+    <w:p>
+      <w:r>
+        <w:rPr>
           <w:b/>
-          <w:i w:val="0"/>
-          <w:color w:val="4A5568"/>
-          <w:sz w:val="20"/>
+          <w:sz w:val="18"/>
         </w:rPr>
         <w:t>Eskatzen da:</w:t>
       </w:r>
@@ -208,12 +130,9 @@
       </w:pPr>
       <w:r>
         <w:rPr>
-          <w:rFonts w:ascii="Calibri" w:hAnsi="Calibri"/>
-          <w:b w:val="0"/>
-          <w:i w:val="0"/>
-          <w:sz w:val="22"/>
+          <w:sz w:val="18"/>
         </w:rPr>
-        <w:t>5 aldiz galdetu (astelehenetik ostiralera).</w:t>
+        <w:t>Gelako ikasle kopuru totala galdetu.</w:t>
       </w:r>
     </w:p>
     <w:p>
@@ -222,75 +141,32 @@
       </w:pPr>
       <w:r>
         <w:rPr>
-          <w:rFonts w:ascii="Calibri" w:hAnsi="Calibri"/>
-          <w:b w:val="0"/>
-          <w:i w:val="0"/>
-          <w:sz w:val="22"/>
+          <w:sz w:val="18"/>
         </w:rPr>
-        <w:t>Batura kalkulatu eta pantailan erakutsi.</w:t>
+        <w:t>5 aldiz galdetu eguneko ikasle kopurua (astelehenetik ostiralera).</w:t>
       </w:r>
     </w:p>
     <w:p>
       <w:pPr>
-        <w:spacing w:after="160"/>
-        <w:ind w:left="283"/>
-        <w:shd w:fill="F4F6F8" w:val="clear"/>
+        <w:pStyle w:val="ListBullet"/>
       </w:pPr>
       <w:r>
         <w:rPr>
-          <w:rFonts w:ascii="Calibri" w:hAnsi="Calibri"/>
-          <w:b w:val="0"/>
-          <w:i w:val="0"/>
-          <w:color w:val="464646"/>
-          <w:sz w:val="20"/>
+          <w:sz w:val="18"/>
         </w:rPr>
-        <w:t>Adibidea:</w:t>
-        <w:br/>
-        <w:t>Eguna 1 – Ikasleak: 24</w:t>
-        <w:br/>
-        <w:t>Eguna 2 – Ikasleak: 22</w:t>
-        <w:br/>
-        <w:t>…</w:t>
-        <w:br/>
-        <w:t>Asteko asistentzia osoa: 112</w:t>
+        <w:t>Asteko asistentzia portzentaia erakutsi.</w:t>
       </w:r>
     </w:p>
     <w:p>
       <w:pPr>
-        <w:spacing w:before="200" w:after="80"/>
+        <w:spacing w:before="120" w:after="40"/>
       </w:pPr>
       <w:r>
         <w:rPr>
-          <w:rFonts w:ascii="Calibri" w:hAnsi="Calibri"/>
           <w:b/>
-          <w:i w:val="0"/>
-          <w:sz w:val="22"/>
+          <w:sz w:val="20"/>
         </w:rPr>
-        <w:t xml:space="preserve">A2. Azterketako notak  </w:t>
-      </w:r>
-      <w:r>
-        <w:rPr>
-          <w:rFonts w:ascii="Calibri" w:hAnsi="Calibri"/>
-          <w:b w:val="0"/>
-          <w:i/>
-          <w:color w:val="0D6E6E"/>
-          <w:sz w:val="18"/>
-        </w:rPr>
-        <w:t>[PARA]</w:t>
-      </w:r>
-    </w:p>
-    <w:p>
-      <w:pPr>
-        <w:spacing w:after="80"/>
-      </w:pPr>
-      <w:r>
-        <w:rPr>
-          <w:rFonts w:ascii="Calibri" w:hAnsi="Calibri"/>
-          <w:b w:val="0"/>
-          <w:i w:val="0"/>
-          <w:sz w:val="22"/>
-        </w:rPr>
-        <w:t>Ikasleak 4 azterketako notak sartuko ditu (0tik 10era). Programak batez bestekoa kalkulatu eta pantailan erakutsiko du.</w:t>
+        <w:t>A2. Atzerako kontaketa – atsedenaldia</w:t>
       </w:r>
     </w:p>
     <w:p>
@@ -299,11 +175,39 @@
       </w:pPr>
       <w:r>
         <w:rPr>
-          <w:rFonts w:ascii="Calibri" w:hAnsi="Calibri"/>
+          <w:sz w:val="18"/>
+        </w:rPr>
+        <w:t>Kiroldegiko pantailak saskibaloi partida batean talde baten posesioa amaitzeko atzerako kontaketa erakusten du. Programak 24tik 0ra zenbatuko du eta pantailan erakusten joan.</w:t>
+      </w:r>
+    </w:p>
+    <w:p>
+      <w:pPr>
+        <w:spacing w:before="120" w:after="40"/>
+      </w:pPr>
+      <w:r>
+        <w:rPr>
           <w:b/>
-          <w:i w:val="0"/>
-          <w:color w:val="4A5568"/>
           <w:sz w:val="20"/>
+        </w:rPr>
+        <w:t>A3. Kantina – hamaiketakoa</w:t>
+      </w:r>
+    </w:p>
+    <w:p>
+      <w:pPr>
+        <w:spacing w:after="40"/>
+      </w:pPr>
+      <w:r>
+        <w:rPr>
+          <w:sz w:val="18"/>
+        </w:rPr>
+        <w:t>Kantinak 8 pertsonaren hileko gastua kalkulatu behar du. Pertsona bakoitzari galdetuko dio zenbat faktura dituen, eta faktura bakoitzaren prezioa galdetzen joango da. Amaieran:</w:t>
+      </w:r>
+    </w:p>
+    <w:p>
+      <w:r>
+        <w:rPr>
+          <w:b/>
+          <w:sz w:val="18"/>
         </w:rPr>
         <w:t>Eskatzen da:</w:t>
       </w:r>
@@ -314,12 +218,9 @@
       </w:pPr>
       <w:r>
         <w:rPr>
-          <w:rFonts w:ascii="Calibri" w:hAnsi="Calibri"/>
-          <w:b w:val="0"/>
-          <w:i w:val="0"/>
-          <w:sz w:val="22"/>
+          <w:sz w:val="18"/>
         </w:rPr>
-        <w:t>PARA buklea erabili 4 notak irakurtzeko.</w:t>
+        <w:t>Pertsona bakoitzaren gastu totala.</w:t>
       </w:r>
     </w:p>
     <w:p>
@@ -328,12 +229,9 @@
       </w:pPr>
       <w:r>
         <w:rPr>
-          <w:rFonts w:ascii="Calibri" w:hAnsi="Calibri"/>
-          <w:b w:val="0"/>
-          <w:i w:val="0"/>
-          <w:sz w:val="22"/>
+          <w:sz w:val="18"/>
         </w:rPr>
-        <w:t>Batura eta batez bestekoa (batura / 4) erakutsi.</w:t>
+        <w:t>Batez besteko gastua pertsonako.</w:t>
       </w:r>
     </w:p>
     <w:p>
@@ -342,100 +240,150 @@
       </w:pPr>
       <w:r>
         <w:rPr>
-          <w:rFonts w:ascii="Calibri" w:hAnsi="Calibri"/>
           <w:b/>
-          <w:i w:val="0"/>
-          <w:sz w:val="22"/>
+          <w:color w:val="1A4A6E"/>
+          <w:sz w:val="24"/>
         </w:rPr>
-        <w:t xml:space="preserve">A3. Atzerako kontaketa – atsedenaldia  </w:t>
-      </w:r>
-      <w:r>
-        <w:rPr>
-          <w:rFonts w:ascii="Calibri" w:hAnsi="Calibri"/>
-          <w:b w:val="0"/>
-          <w:i/>
-          <w:color w:val="0D6E6E"/>
-          <w:sz w:val="18"/>
-        </w:rPr>
-        <w:t>[PARA beheraka]</w:t>
+        <w:t>B. MIENTRAS buklea</w:t>
       </w:r>
     </w:p>
     <w:p>
       <w:pPr>
-        <w:spacing w:after="80"/>
+        <w:spacing w:before="120" w:after="40"/>
       </w:pPr>
       <w:r>
         <w:rPr>
-          <w:rFonts w:ascii="Calibri" w:hAnsi="Calibri"/>
-          <w:b w:val="0"/>
-          <w:i w:val="0"/>
-          <w:sz w:val="22"/>
+          <w:b/>
+          <w:sz w:val="20"/>
         </w:rPr>
-        <w:t xml:space="preserve">Kiroldegiaren pantailak atsedenaldia amaitzeko atzerako kontaketa erakusten du. Erabiltzaileak segundo kopurua sartuko du (adibidez 10) eta programak </w:t>
-      </w:r>
-      <w:r>
-        <w:rPr>
-          <w:rFonts w:ascii="Calibri" w:hAnsi="Calibri"/>
-          <w:b/>
-          <w:i w:val="0"/>
-          <w:sz w:val="22"/>
-        </w:rPr>
-        <w:t>N-tik 1era</w:t>
-      </w:r>
-      <w:r>
-        <w:rPr>
-          <w:rFonts w:ascii="Calibri" w:hAnsi="Calibri"/>
-          <w:b w:val="0"/>
-          <w:i w:val="0"/>
-          <w:sz w:val="22"/>
-        </w:rPr>
-        <w:t xml:space="preserve"> zenbatuko du, amaieran «¡Hasi!» idatziz.</w:t>
+        <w:t>B1. Liburutegiko maileguak</w:t>
       </w:r>
     </w:p>
     <w:p>
       <w:pPr>
-        <w:spacing w:after="160"/>
-        <w:ind w:left="283"/>
-        <w:shd w:fill="F4F6F8" w:val="clear"/>
+        <w:spacing w:after="40"/>
       </w:pPr>
       <w:r>
         <w:rPr>
-          <w:rFonts w:ascii="Calibri" w:hAnsi="Calibri"/>
-          <w:b w:val="0"/>
-          <w:i w:val="0"/>
-          <w:color w:val="464646"/>
-          <w:sz w:val="20"/>
+          <w:sz w:val="18"/>
         </w:rPr>
-        <w:t>Adibidea:</w:t>
-        <w:br/>
-        <w:t>Sartu segundoak: 5</w:t>
-        <w:br/>
-        <w:t>5</w:t>
-        <w:br/>
-        <w:t>4</w:t>
-        <w:br/>
-        <w:t>3</w:t>
-        <w:br/>
-        <w:t>2</w:t>
-        <w:br/>
-        <w:t>1</w:t>
-        <w:br/>
-        <w:t>¡Hasi!</w:t>
+        <w:t>Liburutegiak ikasleen maileguak erregistratzen ditu. Programak liburu-izenburuak irakurtzen joango da «AMAITU» idatzi arte. Amaieran zenbat liburu mailegatu diren esango du.</w:t>
       </w:r>
     </w:p>
     <w:p>
       <w:pPr>
-        <w:spacing w:after="160"/>
+        <w:spacing w:before="120" w:after="40"/>
       </w:pPr>
       <w:r>
         <w:rPr>
-          <w:rFonts w:ascii="Calibri" w:hAnsi="Calibri"/>
-          <w:b w:val="0"/>
-          <w:i/>
-          <w:color w:val="B45309"/>
+          <w:b/>
           <w:sz w:val="20"/>
         </w:rPr>
-        <w:t>Oharra: PARA … Con Paso -1.</w:t>
+        <w:t>B2. Autobusaren txartela</w:t>
+      </w:r>
+    </w:p>
+    <w:p>
+      <w:pPr>
+        <w:spacing w:after="40"/>
+      </w:pPr>
+      <w:r>
+        <w:rPr>
+          <w:sz w:val="18"/>
+        </w:rPr>
+        <w:t>Ikasleak autobus-txartelean 15 € ditu. Bidai bakoitzak 1,20 € balio du. Programak bidaiak kontatzen joango da saldoa agortu arte (edo txartelak ezin duenean beste bidai bat ordaindu). Amaieran zenbat bidai egin dituen eta sobratutako euroak erakutsiko ditu.</w:t>
+      </w:r>
+    </w:p>
+    <w:p>
+      <w:r>
+        <w:rPr>
+          <w:i/>
+          <w:color w:val="8B4513"/>
+          <w:sz w:val="16"/>
+        </w:rPr>
+        <w:t>Oharra: Saldoa ez bada 1,20 €-ra iristen ere bidaia egiten utzi behar dio eta saldo negatiboa ezarri.</w:t>
+      </w:r>
+    </w:p>
+    <w:p>
+      <w:pPr>
+        <w:spacing w:before="120" w:after="40"/>
+      </w:pPr>
+      <w:r>
+        <w:rPr>
+          <w:b/>
+          <w:sz w:val="20"/>
+        </w:rPr>
+        <w:t>B3. Notak</w:t>
+      </w:r>
+    </w:p>
+    <w:p>
+      <w:pPr>
+        <w:spacing w:after="40"/>
+      </w:pPr>
+      <w:r>
+        <w:rPr>
+          <w:sz w:val="18"/>
+        </w:rPr>
+        <w:t>Tutoreak ikasle bakoitzaren izena galdetzen du eta banan bana ikaslearen notak sartzen ditu. 0 sartzen duenean amaitzen da. Programak ikasle bakoitzaren izena eta noten batez bestekoa erakutsiko ditu.</w:t>
+      </w:r>
+    </w:p>
+    <w:p>
+      <w:r>
+        <w:br w:type="page"/>
+      </w:r>
+    </w:p>
+    <w:p>
+      <w:r>
+        <w:drawing>
+          <wp:inline xmlns:a="http://schemas.openxmlformats.org/drawingml/2006/main" xmlns:pic="http://schemas.openxmlformats.org/drawingml/2006/picture">
+            <wp:extent cx="1512000" cy="438545"/>
+            <wp:docPr id="2" name="Picture 2"/>
+            <wp:cNvGraphicFramePr>
+              <a:graphicFrameLocks noChangeAspect="1"/>
+            </wp:cNvGraphicFramePr>
+            <a:graphic>
+              <a:graphicData uri="http://schemas.openxmlformats.org/drawingml/2006/picture">
+                <pic:pic>
+                  <pic:nvPicPr>
+                    <pic:cNvPr id="0" name="izarraitz-logoa.png"/>
+                    <pic:cNvPicPr/>
+                  </pic:nvPicPr>
+                  <pic:blipFill>
+                    <a:blip r:embed="rId9"/>
+                    <a:stretch>
+                      <a:fillRect/>
+                    </a:stretch>
+                  </pic:blipFill>
+                  <pic:spPr>
+                    <a:xfrm>
+                      <a:off x="0" y="0"/>
+                      <a:ext cx="1512000" cy="438545"/>
+                    </a:xfrm>
+                    <a:prstGeom prst="rect"/>
+                  </pic:spPr>
+                </pic:pic>
+              </a:graphicData>
+            </a:graphic>
+          </wp:inline>
+        </w:drawing>
+      </w:r>
+    </w:p>
+    <w:p>
+      <w:pPr>
+        <w:jc w:val="center"/>
+        <w:shd w:fill="D9D9D9" w:val="clear"/>
+        <w:pBdr>
+          <w:top w:val="single" w:sz="12" w:space="4" w:color="222222"/>
+          <w:left w:val="single" w:sz="12" w:space="4" w:color="222222"/>
+          <w:bottom w:val="single" w:sz="12" w:space="4" w:color="222222"/>
+          <w:right w:val="single" w:sz="12" w:space="4" w:color="222222"/>
+        </w:pBdr>
+      </w:pPr>
+      <w:r>
+        <w:rPr>
+          <w:b/>
+          <w:sz w:val="28"/>
+        </w:rPr>
+        <w:t>Bukleak bizitza errealean – ariketa praktikoak (2)</w:t>
       </w:r>
     </w:p>
     <w:p>
@@ -444,36 +392,23 @@
       </w:pPr>
       <w:r>
         <w:rPr>
-          <w:rFonts w:ascii="Calibri" w:hAnsi="Calibri"/>
           <w:b/>
-          <w:i w:val="0"/>
-          <w:sz w:val="22"/>
+          <w:color w:val="1A4A6E"/>
+          <w:sz w:val="24"/>
         </w:rPr>
-        <w:t xml:space="preserve">A4. Kantina – hamaiketakoa  </w:t>
-      </w:r>
-      <w:r>
-        <w:rPr>
-          <w:rFonts w:ascii="Calibri" w:hAnsi="Calibri"/>
-          <w:b w:val="0"/>
-          <w:i/>
-          <w:color w:val="0D6E6E"/>
-          <w:sz w:val="18"/>
-        </w:rPr>
-        <w:t>[PARA]</w:t>
+        <w:t>C. REPETIR buklea</w:t>
       </w:r>
     </w:p>
     <w:p>
       <w:pPr>
-        <w:spacing w:after="80"/>
+        <w:spacing w:before="120" w:after="40"/>
       </w:pPr>
       <w:r>
         <w:rPr>
-          <w:rFonts w:ascii="Calibri" w:hAnsi="Calibri"/>
-          <w:b w:val="0"/>
-          <w:i w:val="0"/>
-          <w:sz w:val="22"/>
+          <w:b/>
+          <w:sz w:val="20"/>
         </w:rPr>
-        <w:t>Kantinak 8 ikasleren hamaiketakoa prestatu behar du. Ikasle bakoitzari galdetuko dio zenbat euro gastatuko dituen. Amaieran:</w:t>
+        <w:t>C1. Pasahitzaren balidazioa</w:t>
       </w:r>
     </w:p>
     <w:p>
@@ -482,11 +417,58 @@
       </w:pPr>
       <w:r>
         <w:rPr>
-          <w:rFonts w:ascii="Calibri" w:hAnsi="Calibri"/>
+          <w:sz w:val="18"/>
+        </w:rPr>
+        <w:t>Eskolako wifiak pasahitza eskatzen du, baina ikasle bakoitzak bere pasahitz propioa du. Programak ikaslearen izena galdetuko du eta pasahitz zuzena «IkaslearenIzena_2026» izango da. Erabiltzaileak asmatu arte galdetzen jarraituko du. Asmatzen duenean «Ongi etorri!» idatzi.</w:t>
+      </w:r>
+    </w:p>
+    <w:p>
+      <w:r>
+        <w:rPr>
+          <w:color w:val="444444"/>
+          <w:sz w:val="16"/>
+        </w:rPr>
+        <w:t>Adibidea:</w:t>
+        <w:br/>
+        <w:t>Zure izena: Jon</w:t>
+        <w:br/>
+        <w:t>Pasahitza: kaixo</w:t>
+        <w:br/>
+        <w:t>Pasahitza: 1234</w:t>
+        <w:br/>
+        <w:t>Pasahitza: Jon_2026</w:t>
+        <w:br/>
+        <w:t>Ongi etorri!</w:t>
+      </w:r>
+    </w:p>
+    <w:p>
+      <w:pPr>
+        <w:spacing w:before="120" w:after="40"/>
+      </w:pPr>
+      <w:r>
+        <w:rPr>
           <w:b/>
-          <w:i w:val="0"/>
-          <w:color w:val="4A5568"/>
           <w:sz w:val="20"/>
+        </w:rPr>
+        <w:t>C2. Menua – jolasaretoa</w:t>
+      </w:r>
+    </w:p>
+    <w:p>
+      <w:pPr>
+        <w:spacing w:after="40"/>
+      </w:pPr>
+      <w:r>
+        <w:rPr>
+          <w:sz w:val="18"/>
+        </w:rPr>
+        <w:t>Jolasaretoko makina batek menu hau erakusten du behin eta berriro, erabiltzaileak 0 aukeratu arte:</w:t>
+      </w:r>
+    </w:p>
+    <w:p>
+      <w:r>
+        <w:rPr>
+          <w:b/>
+          <w:sz w:val="18"/>
         </w:rPr>
         <w:t>Eskatzen da:</w:t>
       </w:r>
@@ -497,12 +479,9 @@
       </w:pPr>
       <w:r>
         <w:rPr>
-          <w:rFonts w:ascii="Calibri" w:hAnsi="Calibri"/>
-          <w:b w:val="0"/>
-          <w:i w:val="0"/>
-          <w:sz w:val="22"/>
+          <w:sz w:val="18"/>
         </w:rPr>
-        <w:t>Gastu totala.</w:t>
+        <w:t>Aukera bakoitzeko mezu labur bat erakutsi (adib. «Futbola aukeratuta»).</w:t>
       </w:r>
     </w:p>
     <w:p>
@@ -511,609 +490,7 @@
       </w:pPr>
       <w:r>
         <w:rPr>
-          <w:rFonts w:ascii="Calibri" w:hAnsi="Calibri"/>
-          <w:b w:val="0"/>
-          <w:i w:val="0"/>
-          <w:sz w:val="22"/>
-        </w:rPr>
-        <w:t>Batez besteko gastua.</w:t>
-      </w:r>
-    </w:p>
-    <w:p>
-      <w:pPr>
-        <w:pStyle w:val="ListBullet"/>
-      </w:pPr>
-      <w:r>
-        <w:rPr>
-          <w:rFonts w:ascii="Calibri" w:hAnsi="Calibri"/>
-          <w:b w:val="0"/>
-          <w:i w:val="0"/>
-          <w:sz w:val="22"/>
-        </w:rPr>
-        <w:t>Zenbat ikaslek gastatu duten 3 € baino gehiago.</w:t>
-      </w:r>
-    </w:p>
-    <w:p>
-      <w:pPr>
-        <w:spacing w:before="320" w:after="80"/>
-      </w:pPr>
-      <w:r>
-        <w:rPr>
-          <w:rFonts w:ascii="Calibri" w:hAnsi="Calibri"/>
-          <w:b/>
-          <w:i w:val="0"/>
-          <w:color w:val="1A2332"/>
-          <w:sz w:val="28"/>
-        </w:rPr>
-        <w:t>B. MIENTRAS buklea</w:t>
-      </w:r>
-    </w:p>
-    <w:p>
-      <w:pPr>
-        <w:spacing w:after="120"/>
-      </w:pPr>
-      <w:r>
-        <w:rPr>
-          <w:rFonts w:ascii="Calibri" w:hAnsi="Calibri"/>
-          <w:b w:val="0"/>
-          <w:i/>
-          <w:color w:val="4A5568"/>
-          <w:sz w:val="20"/>
-        </w:rPr>
-        <w:t>Baldintza hasieran egiaztatzen da. Sentinela bat edo «bitartean…» egoerak.</w:t>
-      </w:r>
-    </w:p>
-    <w:p>
-      <w:pPr>
-        <w:spacing w:before="200" w:after="80"/>
-      </w:pPr>
-      <w:r>
-        <w:rPr>
-          <w:rFonts w:ascii="Calibri" w:hAnsi="Calibri"/>
-          <w:b/>
-          <w:i w:val="0"/>
-          <w:sz w:val="22"/>
-        </w:rPr>
-        <w:t xml:space="preserve">B1. Liburutegiko maileguak  </w:t>
-      </w:r>
-      <w:r>
-        <w:rPr>
-          <w:rFonts w:ascii="Calibri" w:hAnsi="Calibri"/>
-          <w:b w:val="0"/>
-          <w:i/>
-          <w:color w:val="0D6E6E"/>
           <w:sz w:val="18"/>
-        </w:rPr>
-        <w:t>[MIENTRAS]</w:t>
-      </w:r>
-    </w:p>
-    <w:p>
-      <w:pPr>
-        <w:spacing w:after="80"/>
-      </w:pPr>
-      <w:r>
-        <w:rPr>
-          <w:rFonts w:ascii="Calibri" w:hAnsi="Calibri"/>
-          <w:b w:val="0"/>
-          <w:i w:val="0"/>
-          <w:sz w:val="22"/>
-        </w:rPr>
-        <w:t xml:space="preserve">Liburutegiak ikasleen maileguak erregistratzen ditu. Programak liburu-izenburuak irakurtzen joango da </w:t>
-      </w:r>
-      <w:r>
-        <w:rPr>
-          <w:rFonts w:ascii="Calibri" w:hAnsi="Calibri"/>
-          <w:b/>
-          <w:i w:val="0"/>
-          <w:sz w:val="22"/>
-        </w:rPr>
-        <w:t>«AMAITU»</w:t>
-      </w:r>
-      <w:r>
-        <w:rPr>
-          <w:rFonts w:ascii="Calibri" w:hAnsi="Calibri"/>
-          <w:b w:val="0"/>
-          <w:i w:val="0"/>
-          <w:sz w:val="22"/>
-        </w:rPr>
-        <w:t xml:space="preserve"> idatzi arte. Amaieran zenbat liburu mailegatu diren esango du.</w:t>
-      </w:r>
-    </w:p>
-    <w:p>
-      <w:pPr>
-        <w:spacing w:after="160"/>
-        <w:ind w:left="283"/>
-        <w:shd w:fill="F4F6F8" w:val="clear"/>
-      </w:pPr>
-      <w:r>
-        <w:rPr>
-          <w:rFonts w:ascii="Calibri" w:hAnsi="Calibri"/>
-          <w:b w:val="0"/>
-          <w:i w:val="0"/>
-          <w:color w:val="464646"/>
-          <w:sz w:val="20"/>
-        </w:rPr>
-        <w:t>Adibidea:</w:t>
-        <w:br/>
-        <w:t>Liburua: Harry Potter</w:t>
-        <w:br/>
-        <w:t>Liburua: Elkarrekin</w:t>
-        <w:br/>
-        <w:t>Liburua: AMAITU</w:t>
-        <w:br/>
-        <w:t>Mailegatuak: 2</w:t>
-      </w:r>
-    </w:p>
-    <w:p>
-      <w:pPr>
-        <w:spacing w:before="200" w:after="80"/>
-      </w:pPr>
-      <w:r>
-        <w:rPr>
-          <w:rFonts w:ascii="Calibri" w:hAnsi="Calibri"/>
-          <w:b/>
-          <w:i w:val="0"/>
-          <w:sz w:val="22"/>
-        </w:rPr>
-        <w:t xml:space="preserve">B2. Autobusaren txartela  </w:t>
-      </w:r>
-      <w:r>
-        <w:rPr>
-          <w:rFonts w:ascii="Calibri" w:hAnsi="Calibri"/>
-          <w:b w:val="0"/>
-          <w:i/>
-          <w:color w:val="0D6E6E"/>
-          <w:sz w:val="18"/>
-        </w:rPr>
-        <w:t>[MIENTRAS]</w:t>
-      </w:r>
-    </w:p>
-    <w:p>
-      <w:pPr>
-        <w:spacing w:after="80"/>
-      </w:pPr>
-      <w:r>
-        <w:rPr>
-          <w:rFonts w:ascii="Calibri" w:hAnsi="Calibri"/>
-          <w:b w:val="0"/>
-          <w:i w:val="0"/>
-          <w:sz w:val="22"/>
-        </w:rPr>
-        <w:t>Ikasleak autobus-txartelean 15 € ditu. Bidai bakoitzak 1,20 € balio du. Programak bidaiak «kargatzen» joango da saldoa agortu arte (edo txartelak ezin duenean beste bidai bat ordaindu). Amaieran zenbat bidai egin dituen eta sobratutako euroak erakutsiko ditu.</w:t>
-      </w:r>
-    </w:p>
-    <w:p>
-      <w:pPr>
-        <w:spacing w:after="40"/>
-      </w:pPr>
-      <w:r>
-        <w:rPr>
-          <w:rFonts w:ascii="Calibri" w:hAnsi="Calibri"/>
-          <w:b/>
-          <w:i w:val="0"/>
-          <w:color w:val="4A5568"/>
-          <w:sz w:val="20"/>
-        </w:rPr>
-        <w:t>Eskatzen da:</w:t>
-      </w:r>
-    </w:p>
-    <w:p>
-      <w:pPr>
-        <w:pStyle w:val="ListBullet"/>
-      </w:pPr>
-      <w:r>
-        <w:rPr>
-          <w:rFonts w:ascii="Calibri" w:hAnsi="Calibri"/>
-          <w:b w:val="0"/>
-          <w:i w:val="0"/>
-          <w:sz w:val="22"/>
-        </w:rPr>
-        <w:t>Hasierako saldoa: 15.</w:t>
-      </w:r>
-    </w:p>
-    <w:p>
-      <w:pPr>
-        <w:pStyle w:val="ListBullet"/>
-      </w:pPr>
-      <w:r>
-        <w:rPr>
-          <w:rFonts w:ascii="Calibri" w:hAnsi="Calibri"/>
-          <w:b w:val="0"/>
-          <w:i w:val="0"/>
-          <w:sz w:val="22"/>
-        </w:rPr>
-        <w:t>Bidaia bakoitzean 1,20 kendu.</w:t>
-      </w:r>
-    </w:p>
-    <w:p>
-      <w:pPr>
-        <w:pStyle w:val="ListBullet"/>
-      </w:pPr>
-      <w:r>
-        <w:rPr>
-          <w:rFonts w:ascii="Calibri" w:hAnsi="Calibri"/>
-          <w:b w:val="0"/>
-          <w:i w:val="0"/>
-          <w:sz w:val="22"/>
-        </w:rPr>
-        <w:t>Bukatu saldoa &lt; 1,20 denean.</w:t>
-      </w:r>
-    </w:p>
-    <w:p>
-      <w:pPr>
-        <w:spacing w:before="200" w:after="80"/>
-      </w:pPr>
-      <w:r>
-        <w:rPr>
-          <w:rFonts w:ascii="Calibri" w:hAnsi="Calibri"/>
-          <w:b/>
-          <w:i w:val="0"/>
-          <w:sz w:val="22"/>
-        </w:rPr>
-        <w:t xml:space="preserve">B3. Euri-egunen erregistroa  </w:t>
-      </w:r>
-      <w:r>
-        <w:rPr>
-          <w:rFonts w:ascii="Calibri" w:hAnsi="Calibri"/>
-          <w:b w:val="0"/>
-          <w:i/>
-          <w:color w:val="0D6E6E"/>
-          <w:sz w:val="18"/>
-        </w:rPr>
-        <w:t>[MIENTRAS]</w:t>
-      </w:r>
-    </w:p>
-    <w:p>
-      <w:pPr>
-        <w:spacing w:after="80"/>
-      </w:pPr>
-      <w:r>
-        <w:rPr>
-          <w:rFonts w:ascii="Calibri" w:hAnsi="Calibri"/>
-          <w:b w:val="0"/>
-          <w:i w:val="0"/>
-          <w:sz w:val="22"/>
-        </w:rPr>
-        <w:t xml:space="preserve">Meteorologia-taldeak egunero euri egin duen galdetzen du («bai» / «ez»). </w:t>
-      </w:r>
-      <w:r>
-        <w:rPr>
-          <w:rFonts w:ascii="Calibri" w:hAnsi="Calibri"/>
-          <w:b/>
-          <w:i w:val="0"/>
-          <w:sz w:val="22"/>
-        </w:rPr>
-        <w:t>«ez»</w:t>
-      </w:r>
-      <w:r>
-        <w:rPr>
-          <w:rFonts w:ascii="Calibri" w:hAnsi="Calibri"/>
-          <w:b w:val="0"/>
-          <w:i w:val="0"/>
-          <w:sz w:val="22"/>
-        </w:rPr>
-        <w:t xml:space="preserve"> erantzuten den lehenengo egunean bukatzen da. Zenbat egun jarraian egin duen euria erakutsi.</w:t>
-      </w:r>
-    </w:p>
-    <w:p>
-      <w:pPr>
-        <w:spacing w:after="160"/>
-        <w:ind w:left="283"/>
-        <w:shd w:fill="F4F6F8" w:val="clear"/>
-      </w:pPr>
-      <w:r>
-        <w:rPr>
-          <w:rFonts w:ascii="Calibri" w:hAnsi="Calibri"/>
-          <w:b w:val="0"/>
-          <w:i w:val="0"/>
-          <w:color w:val="464646"/>
-          <w:sz w:val="20"/>
-        </w:rPr>
-        <w:t>Adibidea:</w:t>
-        <w:br/>
-        <w:t>Euri egin du? bai</w:t>
-        <w:br/>
-        <w:t>Euri egin du? bai</w:t>
-        <w:br/>
-        <w:t>Euri egin du? bai</w:t>
-        <w:br/>
-        <w:t>Euri egin du? ez</w:t>
-        <w:br/>
-        <w:t>Euri-egun jarraituak: 3</w:t>
-      </w:r>
-    </w:p>
-    <w:p>
-      <w:pPr>
-        <w:spacing w:before="200" w:after="80"/>
-      </w:pPr>
-      <w:r>
-        <w:rPr>
-          <w:rFonts w:ascii="Calibri" w:hAnsi="Calibri"/>
-          <w:b/>
-          <w:i w:val="0"/>
-          <w:sz w:val="22"/>
-        </w:rPr>
-        <w:t xml:space="preserve">B4. Noten sarrera – 0a sentinela  </w:t>
-      </w:r>
-      <w:r>
-        <w:rPr>
-          <w:rFonts w:ascii="Calibri" w:hAnsi="Calibri"/>
-          <w:b w:val="0"/>
-          <w:i/>
-          <w:color w:val="0D6E6E"/>
-          <w:sz w:val="18"/>
-        </w:rPr>
-        <w:t>[MIENTRAS]</w:t>
-      </w:r>
-    </w:p>
-    <w:p>
-      <w:pPr>
-        <w:spacing w:after="80"/>
-      </w:pPr>
-      <w:r>
-        <w:rPr>
-          <w:rFonts w:ascii="Calibri" w:hAnsi="Calibri"/>
-          <w:b w:val="0"/>
-          <w:i w:val="0"/>
-          <w:sz w:val="22"/>
-        </w:rPr>
-        <w:t xml:space="preserve">Tutoreak ikasleen notak sartzen ditu batetik bestera. </w:t>
-      </w:r>
-      <w:r>
-        <w:rPr>
-          <w:rFonts w:ascii="Calibri" w:hAnsi="Calibri"/>
-          <w:b/>
-          <w:i w:val="0"/>
-          <w:sz w:val="22"/>
-        </w:rPr>
-        <w:t>0</w:t>
-      </w:r>
-      <w:r>
-        <w:rPr>
-          <w:rFonts w:ascii="Calibri" w:hAnsi="Calibri"/>
-          <w:b w:val="0"/>
-          <w:i w:val="0"/>
-          <w:sz w:val="22"/>
-        </w:rPr>
-        <w:t xml:space="preserve"> sartzen duenean amaitzen da. Programak noten batura, zenbat nota sartu diren eta batez bestekoa erakutsiko ditu (0a ez da kontuan hartu behar).</w:t>
-      </w:r>
-    </w:p>
-    <w:p>
-      <w:pPr>
-        <w:spacing w:after="160"/>
-      </w:pPr>
-      <w:r>
-        <w:rPr>
-          <w:rFonts w:ascii="Calibri" w:hAnsi="Calibri"/>
-          <w:b w:val="0"/>
-          <w:i/>
-          <w:color w:val="B45309"/>
-          <w:sz w:val="20"/>
-        </w:rPr>
-        <w:t>Oharra: Landutako 4. ariketa (fluxu-diagramak) gogorarazten dizu? Hona testuingurua!</w:t>
-      </w:r>
-    </w:p>
-    <w:p>
-      <w:pPr>
-        <w:spacing w:before="320" w:after="80"/>
-      </w:pPr>
-      <w:r>
-        <w:rPr>
-          <w:rFonts w:ascii="Calibri" w:hAnsi="Calibri"/>
-          <w:b/>
-          <w:i w:val="0"/>
-          <w:color w:val="1A2332"/>
-          <w:sz w:val="28"/>
-        </w:rPr>
-        <w:t>C. REPETIR buklea</w:t>
-      </w:r>
-    </w:p>
-    <w:p>
-      <w:pPr>
-        <w:spacing w:after="120"/>
-      </w:pPr>
-      <w:r>
-        <w:rPr>
-          <w:rFonts w:ascii="Calibri" w:hAnsi="Calibri"/>
-          <w:b w:val="0"/>
-          <w:i/>
-          <w:color w:val="4A5568"/>
-          <w:sz w:val="20"/>
-        </w:rPr>
-        <w:t>Gutxienez behin egin behar da, eta baldintza amaieran egiaztatzen da.</w:t>
-      </w:r>
-    </w:p>
-    <w:p>
-      <w:pPr>
-        <w:spacing w:before="200" w:after="80"/>
-      </w:pPr>
-      <w:r>
-        <w:rPr>
-          <w:rFonts w:ascii="Calibri" w:hAnsi="Calibri"/>
-          <w:b/>
-          <w:i w:val="0"/>
-          <w:sz w:val="22"/>
-        </w:rPr>
-        <w:t xml:space="preserve">C1. Pasahitzaren balidazioa  </w:t>
-      </w:r>
-      <w:r>
-        <w:rPr>
-          <w:rFonts w:ascii="Calibri" w:hAnsi="Calibri"/>
-          <w:b w:val="0"/>
-          <w:i/>
-          <w:color w:val="0D6E6E"/>
-          <w:sz w:val="18"/>
-        </w:rPr>
-        <w:t>[REPETIR]</w:t>
-      </w:r>
-    </w:p>
-    <w:p>
-      <w:pPr>
-        <w:spacing w:after="80"/>
-      </w:pPr>
-      <w:r>
-        <w:rPr>
-          <w:rFonts w:ascii="Calibri" w:hAnsi="Calibri"/>
-          <w:b w:val="0"/>
-          <w:i w:val="0"/>
-          <w:sz w:val="22"/>
-        </w:rPr>
-        <w:t xml:space="preserve">Eskolako wifiak pasahitza eskatzen du. Pasahitz zuzena </w:t>
-      </w:r>
-      <w:r>
-        <w:rPr>
-          <w:rFonts w:ascii="Calibri" w:hAnsi="Calibri"/>
-          <w:b/>
-          <w:i w:val="0"/>
-          <w:sz w:val="22"/>
-        </w:rPr>
-        <w:t>«Ikastola2026»</w:t>
-      </w:r>
-      <w:r>
-        <w:rPr>
-          <w:rFonts w:ascii="Calibri" w:hAnsi="Calibri"/>
-          <w:b w:val="0"/>
-          <w:i w:val="0"/>
-          <w:sz w:val="22"/>
-        </w:rPr>
-        <w:t xml:space="preserve"> da. Erabiltzaileak asmatu arte galdetzen jarraituko du. Asmatzen duenean «Ongi etorri!» idatzi.</w:t>
-      </w:r>
-    </w:p>
-    <w:p>
-      <w:pPr>
-        <w:spacing w:after="160"/>
-        <w:ind w:left="283"/>
-        <w:shd w:fill="F4F6F8" w:val="clear"/>
-      </w:pPr>
-      <w:r>
-        <w:rPr>
-          <w:rFonts w:ascii="Calibri" w:hAnsi="Calibri"/>
-          <w:b w:val="0"/>
-          <w:i w:val="0"/>
-          <w:color w:val="464646"/>
-          <w:sz w:val="20"/>
-        </w:rPr>
-        <w:t>Adibidea:</w:t>
-        <w:br/>
-        <w:t>Pasahitza: kaixo</w:t>
-        <w:br/>
-        <w:t>Pasahitza: 1234</w:t>
-        <w:br/>
-        <w:t>Pasahitza: Ikastola2026</w:t>
-        <w:br/>
-        <w:t>Ongi etorri!</w:t>
-      </w:r>
-    </w:p>
-    <w:p>
-      <w:pPr>
-        <w:spacing w:after="160"/>
-      </w:pPr>
-      <w:r>
-        <w:rPr>
-          <w:rFonts w:ascii="Calibri" w:hAnsi="Calibri"/>
-          <w:b w:val="0"/>
-          <w:i/>
-          <w:color w:val="B45309"/>
-          <w:sz w:val="20"/>
-        </w:rPr>
-        <w:t>Oharra: REPETIR … Hasta Que pasahitza = "Ikastola2026"</w:t>
-      </w:r>
-    </w:p>
-    <w:p>
-      <w:pPr>
-        <w:spacing w:before="200" w:after="80"/>
-      </w:pPr>
-      <w:r>
-        <w:rPr>
-          <w:rFonts w:ascii="Calibri" w:hAnsi="Calibri"/>
-          <w:b/>
-          <w:i w:val="0"/>
-          <w:sz w:val="22"/>
-        </w:rPr>
-        <w:t xml:space="preserve">C2. Menua – jolasaretoa  </w:t>
-      </w:r>
-      <w:r>
-        <w:rPr>
-          <w:rFonts w:ascii="Calibri" w:hAnsi="Calibri"/>
-          <w:b w:val="0"/>
-          <w:i/>
-          <w:color w:val="0D6E6E"/>
-          <w:sz w:val="18"/>
-        </w:rPr>
-        <w:t>[REPETIR]</w:t>
-      </w:r>
-    </w:p>
-    <w:p>
-      <w:pPr>
-        <w:spacing w:after="80"/>
-      </w:pPr>
-      <w:r>
-        <w:rPr>
-          <w:rFonts w:ascii="Calibri" w:hAnsi="Calibri"/>
-          <w:b w:val="0"/>
-          <w:i w:val="0"/>
-          <w:sz w:val="22"/>
-        </w:rPr>
-        <w:t xml:space="preserve">Jolasaretoko makina batek menu hau erakusten du behin eta berriro, erabiltzaileak </w:t>
-      </w:r>
-      <w:r>
-        <w:rPr>
-          <w:rFonts w:ascii="Calibri" w:hAnsi="Calibri"/>
-          <w:b/>
-          <w:i w:val="0"/>
-          <w:sz w:val="22"/>
-        </w:rPr>
-        <w:t>0</w:t>
-      </w:r>
-      <w:r>
-        <w:rPr>
-          <w:rFonts w:ascii="Calibri" w:hAnsi="Calibri"/>
-          <w:b w:val="0"/>
-          <w:i w:val="0"/>
-          <w:sz w:val="22"/>
-        </w:rPr>
-        <w:t xml:space="preserve"> aukeratu arte:</w:t>
-      </w:r>
-    </w:p>
-    <w:p>
-      <w:pPr>
-        <w:spacing w:after="40"/>
-      </w:pPr>
-      <w:r>
-        <w:rPr>
-          <w:rFonts w:ascii="Calibri" w:hAnsi="Calibri"/>
-          <w:b/>
-          <w:i w:val="0"/>
-          <w:color w:val="4A5568"/>
-          <w:sz w:val="20"/>
-        </w:rPr>
-        <w:t>Eskatzen da:</w:t>
-      </w:r>
-    </w:p>
-    <w:p>
-      <w:pPr>
-        <w:pStyle w:val="ListBullet"/>
-      </w:pPr>
-      <w:r>
-        <w:rPr>
-          <w:rFonts w:ascii="Calibri" w:hAnsi="Calibri"/>
-          <w:b w:val="0"/>
-          <w:i w:val="0"/>
-          <w:sz w:val="22"/>
-        </w:rPr>
-        <w:t>Aukera bakoitzeko mezu labur bat erakutsi (adib. «Futbitoa aukeratuta»).</w:t>
-      </w:r>
-    </w:p>
-    <w:p>
-      <w:pPr>
-        <w:pStyle w:val="ListBullet"/>
-      </w:pPr>
-      <w:r>
-        <w:rPr>
-          <w:rFonts w:ascii="Calibri" w:hAnsi="Calibri"/>
-          <w:b w:val="0"/>
-          <w:i w:val="0"/>
-          <w:sz w:val="22"/>
         </w:rPr>
         <w:t>0 aukeratzen denean «Agur!» idatzi eta bukatu.</w:t>
       </w:r>
@@ -1124,31 +501,20 @@
       </w:pPr>
       <w:r>
         <w:rPr>
-          <w:rFonts w:ascii="Calibri" w:hAnsi="Calibri"/>
-          <w:b w:val="0"/>
-          <w:i w:val="0"/>
-          <w:sz w:val="22"/>
+          <w:sz w:val="18"/>
         </w:rPr>
         <w:t>Aukera baliogabea bada, «Aukera okerra» esan eta menua erakutsi berriro.</w:t>
       </w:r>
     </w:p>
     <w:p>
-      <w:pPr>
-        <w:spacing w:after="160"/>
-        <w:ind w:left="283"/>
-        <w:shd w:fill="F4F6F8" w:val="clear"/>
-      </w:pPr>
       <w:r>
         <w:rPr>
-          <w:rFonts w:ascii="Calibri" w:hAnsi="Calibri"/>
-          <w:b w:val="0"/>
-          <w:i w:val="0"/>
-          <w:color w:val="464646"/>
-          <w:sz w:val="20"/>
+          <w:color w:val="444444"/>
+          <w:sz w:val="16"/>
         </w:rPr>
         <w:t>Adibidea:</w:t>
         <w:br/>
-        <w:t>1. Futbitoa</w:t>
+        <w:t>1. Futbola</w:t>
         <w:br/>
         <w:t>2. Saskibaloia</w:t>
         <w:br/>
@@ -1165,251 +531,64 @@
       </w:pPr>
       <w:r>
         <w:rPr>
-          <w:rFonts w:ascii="Calibri" w:hAnsi="Calibri"/>
           <w:b/>
-          <w:i w:val="0"/>
-          <w:sz w:val="22"/>
+          <w:color w:val="1A4A6E"/>
+          <w:sz w:val="24"/>
         </w:rPr>
-        <w:t xml:space="preserve">C3. Adinaren baieztapena  </w:t>
-      </w:r>
-      <w:r>
-        <w:rPr>
-          <w:rFonts w:ascii="Calibri" w:hAnsi="Calibri"/>
-          <w:b w:val="0"/>
-          <w:i/>
-          <w:color w:val="0D6E6E"/>
-          <w:sz w:val="18"/>
-        </w:rPr>
-        <w:t>[REPETIR]</w:t>
+        <w:t>D. Zuk aukeratu bukle mota</w:t>
       </w:r>
     </w:p>
     <w:p>
       <w:pPr>
-        <w:spacing w:after="80"/>
+        <w:spacing w:before="120" w:after="40"/>
       </w:pPr>
       <w:r>
         <w:rPr>
-          <w:rFonts w:ascii="Calibri" w:hAnsi="Calibri"/>
-          <w:b w:val="0"/>
-          <w:i w:val="0"/>
-          <w:sz w:val="22"/>
+          <w:b/>
+          <w:sz w:val="20"/>
         </w:rPr>
-        <w:t>Webgune batek erabiltzailearen adina eskatzen du. Adinak 1 eta 120 artean egon behar du; bestela berriro galdetu. Adin zuzena sartzen denean, «Adina onartuta: X» erakutsi.</w:t>
+        <w:t>D1. Futbol-taldeko golegileak</w:t>
       </w:r>
     </w:p>
     <w:p>
       <w:pPr>
-        <w:spacing w:before="200" w:after="80"/>
+        <w:spacing w:after="40"/>
       </w:pPr>
       <w:r>
         <w:rPr>
-          <w:rFonts w:ascii="Calibri" w:hAnsi="Calibri"/>
-          <w:b/>
-          <w:i w:val="0"/>
-          <w:sz w:val="22"/>
-        </w:rPr>
-        <w:t xml:space="preserve">C4. Kutxazaina – zenbatekoa  </w:t>
-      </w:r>
-      <w:r>
-        <w:rPr>
-          <w:rFonts w:ascii="Calibri" w:hAnsi="Calibri"/>
-          <w:b w:val="0"/>
-          <w:i/>
-          <w:color w:val="0D6E6E"/>
           <w:sz w:val="18"/>
-        </w:rPr>
-        <w:t>[REPETIR]</w:t>
-      </w:r>
-    </w:p>
-    <w:p>
-      <w:pPr>
-        <w:spacing w:after="80"/>
-      </w:pPr>
-      <w:r>
-        <w:rPr>
-          <w:rFonts w:ascii="Calibri" w:hAnsi="Calibri"/>
-          <w:b w:val="0"/>
-          <w:i w:val="0"/>
-          <w:sz w:val="22"/>
-        </w:rPr>
-        <w:t xml:space="preserve">Eskolako jaietako kutxazainak produktu baten prezioa eskatzen du. Prezioak </w:t>
-      </w:r>
-      <w:r>
-        <w:rPr>
-          <w:rFonts w:ascii="Calibri" w:hAnsi="Calibri"/>
-          <w:b/>
-          <w:i w:val="0"/>
-          <w:sz w:val="22"/>
-        </w:rPr>
-        <w:t>0 baino handiagoa</w:t>
-      </w:r>
-      <w:r>
-        <w:rPr>
-          <w:rFonts w:ascii="Calibri" w:hAnsi="Calibri"/>
-          <w:b w:val="0"/>
-          <w:i w:val="0"/>
-          <w:sz w:val="22"/>
-        </w:rPr>
-        <w:t xml:space="preserve"> izan behar du. Zenbateko balioduna sartu arte errepikatu, eta ondoren BEZa (+%21) kalkulatu eta erakutsi.</w:t>
-      </w:r>
-    </w:p>
-    <w:p>
-      <w:pPr>
-        <w:spacing w:before="320" w:after="80"/>
-      </w:pPr>
-      <w:r>
-        <w:rPr>
-          <w:rFonts w:ascii="Calibri" w:hAnsi="Calibri"/>
-          <w:b/>
-          <w:i w:val="0"/>
-          <w:color w:val="1A2332"/>
-          <w:sz w:val="28"/>
-        </w:rPr>
-        <w:t>D. Aukera librea – zein bukle?</w:t>
-      </w:r>
-    </w:p>
-    <w:p>
-      <w:pPr>
-        <w:spacing w:after="120"/>
-      </w:pPr>
-      <w:r>
-        <w:rPr>
-          <w:rFonts w:ascii="Calibri" w:hAnsi="Calibri"/>
-          <w:b w:val="0"/>
-          <w:i/>
-          <w:color w:val="4A5568"/>
-          <w:sz w:val="20"/>
-        </w:rPr>
-        <w:t>Zuk erabaki PARA, MIENTRAS edo REPETIR. Justifikatu laburki zergatik.</w:t>
-      </w:r>
-    </w:p>
-    <w:p>
-      <w:pPr>
-        <w:spacing w:before="200" w:after="80"/>
-      </w:pPr>
-      <w:r>
-        <w:rPr>
-          <w:rFonts w:ascii="Calibri" w:hAnsi="Calibri"/>
-          <w:b/>
-          <w:i w:val="0"/>
-          <w:sz w:val="22"/>
-        </w:rPr>
-        <w:t xml:space="preserve">D1. Etxeko lanen zerrenda  </w:t>
-      </w:r>
-      <w:r>
-        <w:rPr>
-          <w:rFonts w:ascii="Calibri" w:hAnsi="Calibri"/>
-          <w:b w:val="0"/>
-          <w:i/>
-          <w:color w:val="0D6E6E"/>
-          <w:sz w:val="18"/>
-        </w:rPr>
-        <w:t>[AUKERA LIBREA]</w:t>
-      </w:r>
-    </w:p>
-    <w:p>
-      <w:pPr>
-        <w:spacing w:after="80"/>
-      </w:pPr>
-      <w:r>
-        <w:rPr>
-          <w:rFonts w:ascii="Calibri" w:hAnsi="Calibri"/>
-          <w:b w:val="0"/>
-          <w:i w:val="0"/>
-          <w:sz w:val="22"/>
-        </w:rPr>
-        <w:t>Ikasleak etxeko lanak idazten ditu batetik bestera. «GABE» idazten duenean amaitzen da. Zenbat etxeko lan dituen eta hitz bakoitza pantailan zerrendatzen dituen programa.</w:t>
-      </w:r>
-    </w:p>
-    <w:p>
-      <w:pPr>
-        <w:spacing w:before="200" w:after="80"/>
-      </w:pPr>
-      <w:r>
-        <w:rPr>
-          <w:rFonts w:ascii="Calibri" w:hAnsi="Calibri"/>
-          <w:b/>
-          <w:i w:val="0"/>
-          <w:sz w:val="22"/>
-        </w:rPr>
-        <w:t xml:space="preserve">D2. Futbol-taldearen golegileak  </w:t>
-      </w:r>
-      <w:r>
-        <w:rPr>
-          <w:rFonts w:ascii="Calibri" w:hAnsi="Calibri"/>
-          <w:b w:val="0"/>
-          <w:i/>
-          <w:color w:val="0D6E6E"/>
-          <w:sz w:val="18"/>
-        </w:rPr>
-        <w:t>[AUKERA LIBREA]</w:t>
-      </w:r>
-    </w:p>
-    <w:p>
-      <w:pPr>
-        <w:spacing w:after="80"/>
-      </w:pPr>
-      <w:r>
-        <w:rPr>
-          <w:rFonts w:ascii="Calibri" w:hAnsi="Calibri"/>
-          <w:b w:val="0"/>
-          <w:i w:val="0"/>
-          <w:sz w:val="22"/>
         </w:rPr>
         <w:t>Taldeak 11 jokalari ditu. Jokalari bakoitzak zenbat gol sartu dituen galdetu. Amaieran: gol totalak, batez bestekoa, eta golik gehien sartu dituenaren kopurua (izenik gabe, zenbakia soilik).</w:t>
       </w:r>
     </w:p>
     <w:p>
       <w:pPr>
-        <w:spacing w:before="200" w:after="80"/>
+        <w:spacing w:before="120" w:after="40"/>
       </w:pPr>
       <w:r>
         <w:rPr>
-          <w:rFonts w:ascii="Calibri" w:hAnsi="Calibri"/>
           <w:b/>
-          <w:i w:val="0"/>
-          <w:sz w:val="22"/>
+          <w:sz w:val="20"/>
         </w:rPr>
-        <w:t xml:space="preserve">D3. Aurrezki-kutxa  </w:t>
-      </w:r>
-      <w:r>
-        <w:rPr>
-          <w:rFonts w:ascii="Calibri" w:hAnsi="Calibri"/>
-          <w:b w:val="0"/>
-          <w:i/>
-          <w:color w:val="0D6E6E"/>
-          <w:sz w:val="18"/>
-        </w:rPr>
-        <w:t>[AUKERA LIBREA]</w:t>
+        <w:t>D2. Aurrezki-kutxa</w:t>
       </w:r>
     </w:p>
     <w:p>
       <w:pPr>
-        <w:spacing w:after="80"/>
+        <w:spacing w:after="40"/>
       </w:pPr>
       <w:r>
         <w:rPr>
-          <w:rFonts w:ascii="Calibri" w:hAnsi="Calibri"/>
-          <w:b w:val="0"/>
-          <w:i w:val="0"/>
-          <w:sz w:val="22"/>
+          <w:sz w:val="18"/>
         </w:rPr>
         <w:t>Ikasleak astelehenero 5 € sartzen ditu kutxan, 80 € lortu arte. Programak asteak zenbatzen ditu eta aste bakoitzean kutxan zenbat dagoen erakusten du. Helburura iristean «Helburua lortuta!» idatzi.</w:t>
       </w:r>
     </w:p>
     <w:p>
-      <w:pPr>
-        <w:spacing w:after="160"/>
-        <w:ind w:left="283"/>
-        <w:shd w:fill="F4F6F8" w:val="clear"/>
-      </w:pPr>
       <w:r>
         <w:rPr>
-          <w:rFonts w:ascii="Calibri" w:hAnsi="Calibri"/>
-          <w:b w:val="0"/>
-          <w:i w:val="0"/>
-          <w:color w:val="464646"/>
-          <w:sz w:val="20"/>
+          <w:color w:val="444444"/>
+          <w:sz w:val="16"/>
         </w:rPr>
         <w:t>Adibidea:</w:t>
         <w:br/>
@@ -1424,212 +603,32 @@
     </w:p>
     <w:p>
       <w:pPr>
-        <w:spacing w:before="200" w:after="80"/>
+        <w:spacing w:before="120" w:after="40"/>
       </w:pPr>
       <w:r>
         <w:rPr>
-          <w:rFonts w:ascii="Calibri" w:hAnsi="Calibri"/>
           <w:b/>
-          <w:i w:val="0"/>
-          <w:sz w:val="22"/>
+          <w:sz w:val="20"/>
         </w:rPr>
-        <w:t xml:space="preserve">D4. Inprimagailua – orrialdeak  </w:t>
-      </w:r>
-      <w:r>
-        <w:rPr>
-          <w:rFonts w:ascii="Calibri" w:hAnsi="Calibri"/>
-          <w:b w:val="0"/>
-          <w:i/>
-          <w:color w:val="0D6E6E"/>
-          <w:sz w:val="18"/>
-        </w:rPr>
-        <w:t>[AUKERA LIBREA]</w:t>
+        <w:t>D3. Ordutegia – 5 egun × 6 eskola-ordu</w:t>
       </w:r>
     </w:p>
     <w:p>
       <w:pPr>
-        <w:spacing w:after="80"/>
+        <w:spacing w:after="40"/>
       </w:pPr>
       <w:r>
         <w:rPr>
-          <w:rFonts w:ascii="Calibri" w:hAnsi="Calibri"/>
-          <w:b w:val="0"/>
-          <w:i w:val="0"/>
-          <w:sz w:val="22"/>
-        </w:rPr>
-        <w:t>Inprimagailuak 50 orrialde ditu. Erabiltzaileari galdetzen zaio zenbat orrialde inprimatu nahi dituen. Nahikoa paper badago, kendu eta jarraitu; bestela «Paperik ez» esan eta bukatu. Amaieran zenbat orrialde geratzen diren erakutsi.</w:t>
-      </w:r>
-    </w:p>
-    <w:p>
-      <w:pPr>
-        <w:spacing w:before="200" w:after="80"/>
-      </w:pPr>
-      <w:r>
-        <w:rPr>
-          <w:rFonts w:ascii="Calibri" w:hAnsi="Calibri"/>
-          <w:b/>
-          <w:i w:val="0"/>
-          <w:sz w:val="22"/>
-        </w:rPr>
-        <w:t xml:space="preserve">D5. Bikoitiak eta bakoitiak – jolasgaraia  </w:t>
-      </w:r>
-      <w:r>
-        <w:rPr>
-          <w:rFonts w:ascii="Calibri" w:hAnsi="Calibri"/>
-          <w:b w:val="0"/>
-          <w:i/>
-          <w:color w:val="0D6E6E"/>
           <w:sz w:val="18"/>
-        </w:rPr>
-        <w:t>[AUKERA LIBREA]</w:t>
-      </w:r>
-    </w:p>
-    <w:p>
-      <w:pPr>
-        <w:spacing w:after="80"/>
-      </w:pPr>
-      <w:r>
-        <w:rPr>
-          <w:rFonts w:ascii="Calibri" w:hAnsi="Calibri"/>
-          <w:b w:val="0"/>
-          <w:i w:val="0"/>
-          <w:sz w:val="22"/>
-        </w:rPr>
-        <w:t xml:space="preserve">Jolasgaraian 20 ikaslek dorsal-zenbakiak dituzte (1etik 20ra). Programak dorsal bakoitza aztertu eta bi taldetan banatuko ditu: </w:t>
-      </w:r>
-      <w:r>
-        <w:rPr>
-          <w:rFonts w:ascii="Calibri" w:hAnsi="Calibri"/>
-          <w:b/>
-          <w:i w:val="0"/>
-          <w:sz w:val="22"/>
-        </w:rPr>
-        <w:t>bikoitiak</w:t>
-      </w:r>
-      <w:r>
-        <w:rPr>
-          <w:rFonts w:ascii="Calibri" w:hAnsi="Calibri"/>
-          <w:b w:val="0"/>
-          <w:i w:val="0"/>
-          <w:sz w:val="22"/>
-        </w:rPr>
-        <w:t xml:space="preserve"> eta </w:t>
-      </w:r>
-      <w:r>
-        <w:rPr>
-          <w:rFonts w:ascii="Calibri" w:hAnsi="Calibri"/>
-          <w:b/>
-          <w:i w:val="0"/>
-          <w:sz w:val="22"/>
-        </w:rPr>
-        <w:t>bakoitiak</w:t>
-      </w:r>
-      <w:r>
-        <w:rPr>
-          <w:rFonts w:ascii="Calibri" w:hAnsi="Calibri"/>
-          <w:b w:val="0"/>
-          <w:i w:val="0"/>
-          <w:sz w:val="22"/>
-        </w:rPr>
-        <w:t>. Amaieran talde bakoitzeko dorsal-batura erakutsi.</w:t>
-      </w:r>
-    </w:p>
-    <w:p>
-      <w:pPr>
-        <w:spacing w:after="160"/>
-      </w:pPr>
-      <w:r>
-        <w:rPr>
-          <w:rFonts w:ascii="Calibri" w:hAnsi="Calibri"/>
-          <w:b w:val="0"/>
-          <w:i/>
-          <w:color w:val="B45309"/>
-          <w:sz w:val="20"/>
-        </w:rPr>
-        <w:t>Oharra: Landutako «bakoitiBikoiti200» ariketa gogorarazten dizu? Oraingoan 1–20 eta jolasgaiako testuingurua.</w:t>
-      </w:r>
-    </w:p>
-    <w:p>
-      <w:pPr>
-        <w:spacing w:before="320" w:after="80"/>
-      </w:pPr>
-      <w:r>
-        <w:rPr>
-          <w:rFonts w:ascii="Calibri" w:hAnsi="Calibri"/>
-          <w:b/>
-          <w:i w:val="0"/>
-          <w:color w:val="1A2332"/>
-          <w:sz w:val="28"/>
-        </w:rPr>
-        <w:t>E. Erronka (bi bukle edo gehiago)</w:t>
-      </w:r>
-    </w:p>
-    <w:p>
-      <w:pPr>
-        <w:spacing w:after="120"/>
-      </w:pPr>
-      <w:r>
-        <w:rPr>
-          <w:rFonts w:ascii="Calibri" w:hAnsi="Calibri"/>
-          <w:b w:val="0"/>
-          <w:i/>
-          <w:color w:val="4A5568"/>
-          <w:sz w:val="20"/>
-        </w:rPr>
-        <w:t>Bukle bat beste baten barruan edo bi bukle jarraian. Zailagoa, baina egingarria.</w:t>
-      </w:r>
-    </w:p>
-    <w:p>
-      <w:pPr>
-        <w:spacing w:before="200" w:after="80"/>
-      </w:pPr>
-      <w:r>
-        <w:rPr>
-          <w:rFonts w:ascii="Calibri" w:hAnsi="Calibri"/>
-          <w:b/>
-          <w:i w:val="0"/>
-          <w:sz w:val="22"/>
-        </w:rPr>
-        <w:t xml:space="preserve">E1. Ordutegia – 5 egun × 6 eskola-ordu  </w:t>
-      </w:r>
-      <w:r>
-        <w:rPr>
-          <w:rFonts w:ascii="Calibri" w:hAnsi="Calibri"/>
-          <w:b w:val="0"/>
-          <w:i/>
-          <w:color w:val="0D6E6E"/>
-          <w:sz w:val="18"/>
-        </w:rPr>
-        <w:t>[ERRONKA]</w:t>
-      </w:r>
-    </w:p>
-    <w:p>
-      <w:pPr>
-        <w:spacing w:after="80"/>
-      </w:pPr>
-      <w:r>
-        <w:rPr>
-          <w:rFonts w:ascii="Calibri" w:hAnsi="Calibri"/>
-          <w:b w:val="0"/>
-          <w:i w:val="0"/>
-          <w:sz w:val="22"/>
         </w:rPr>
         <w:t>Astean 5 egunetan, egun bakoitzean 6 eskola-ordu daude. Programa batek egun bakoitzerako («Astelehena», «Asteartea»…) 1etik 6ra orduak zerrendatuko ditu.</w:t>
       </w:r>
     </w:p>
     <w:p>
-      <w:pPr>
-        <w:spacing w:after="160"/>
-        <w:ind w:left="283"/>
-        <w:shd w:fill="F4F6F8" w:val="clear"/>
-      </w:pPr>
       <w:r>
         <w:rPr>
-          <w:rFonts w:ascii="Calibri" w:hAnsi="Calibri"/>
-          <w:b w:val="0"/>
-          <w:i w:val="0"/>
-          <w:color w:val="464646"/>
-          <w:sz w:val="20"/>
+          <w:color w:val="444444"/>
+          <w:sz w:val="16"/>
         </w:rPr>
         <w:t>Adibidea:</w:t>
         <w:br/>
@@ -1650,563 +649,30 @@
     </w:p>
     <w:p>
       <w:pPr>
-        <w:spacing w:after="160"/>
+        <w:spacing w:before="120" w:after="40"/>
       </w:pPr>
       <w:r>
         <w:rPr>
-          <w:rFonts w:ascii="Calibri" w:hAnsi="Calibri"/>
-          <w:b w:val="0"/>
-          <w:i/>
-          <w:color w:val="B45309"/>
+          <w:b/>
           <w:sz w:val="20"/>
         </w:rPr>
-        <w:t>Oharra: Bi PARA bukle habiaratu (bata egunetarako, bestea orduetarako).</w:t>
+        <w:t>D4. Pasahitza + 3 saiakera</w:t>
       </w:r>
     </w:p>
     <w:p>
       <w:pPr>
-        <w:spacing w:before="200" w:after="80"/>
+        <w:spacing w:after="40"/>
       </w:pPr>
       <w:r>
         <w:rPr>
-          <w:rFonts w:ascii="Calibri" w:hAnsi="Calibri"/>
-          <w:b/>
-          <w:i w:val="0"/>
-          <w:sz w:val="22"/>
-        </w:rPr>
-        <w:t xml:space="preserve">E2. Pasahitza + 3 saiakera  </w:t>
-      </w:r>
-      <w:r>
-        <w:rPr>
-          <w:rFonts w:ascii="Calibri" w:hAnsi="Calibri"/>
-          <w:b w:val="0"/>
-          <w:i/>
-          <w:color w:val="0D6E6E"/>
           <w:sz w:val="18"/>
         </w:rPr>
-        <w:t>[ERRONKA]</w:t>
-      </w:r>
-    </w:p>
-    <w:p>
-      <w:pPr>
-        <w:spacing w:after="80"/>
-      </w:pPr>
-      <w:r>
-        <w:rPr>
-          <w:rFonts w:ascii="Calibri" w:hAnsi="Calibri"/>
-          <w:b w:val="0"/>
-          <w:i w:val="0"/>
-          <w:sz w:val="22"/>
-        </w:rPr>
-        <w:t xml:space="preserve">C1 bezala, baina gehienez </w:t>
-      </w:r>
-      <w:r>
-        <w:rPr>
-          <w:rFonts w:ascii="Calibri" w:hAnsi="Calibri"/>
-          <w:b/>
-          <w:i w:val="0"/>
-          <w:sz w:val="22"/>
-        </w:rPr>
-        <w:t>3 saiakera</w:t>
-      </w:r>
-      <w:r>
-        <w:rPr>
-          <w:rFonts w:ascii="Calibri" w:hAnsi="Calibri"/>
-          <w:b w:val="0"/>
-          <w:i w:val="0"/>
-          <w:sz w:val="22"/>
-        </w:rPr>
-        <w:t xml:space="preserve"> daude. Asmatzen badu: «Ongi etorri!». 3 aldiz huts egiten badu: «Blokeatuta. Joan irakaslearengana.».</w:t>
-      </w:r>
-    </w:p>
-    <w:p>
-      <w:pPr>
-        <w:spacing w:before="200" w:after="80"/>
-      </w:pPr>
-      <w:r>
-        <w:rPr>
-          <w:rFonts w:ascii="Calibri" w:hAnsi="Calibri"/>
-          <w:b/>
-          <w:i w:val="0"/>
-          <w:sz w:val="22"/>
-        </w:rPr>
-        <w:t xml:space="preserve">E3. Piramide pertsonalizatua – izena  </w:t>
-      </w:r>
-      <w:r>
-        <w:rPr>
-          <w:rFonts w:ascii="Calibri" w:hAnsi="Calibri"/>
-          <w:b w:val="0"/>
-          <w:i/>
-          <w:color w:val="0D6E6E"/>
-          <w:sz w:val="18"/>
-        </w:rPr>
-        <w:t>[ERRONKA]</w:t>
-      </w:r>
-    </w:p>
-    <w:p>
-      <w:pPr>
-        <w:spacing w:after="80"/>
-      </w:pPr>
-      <w:r>
-        <w:rPr>
-          <w:rFonts w:ascii="Calibri" w:hAnsi="Calibri"/>
-          <w:b w:val="0"/>
-          <w:i w:val="0"/>
-          <w:sz w:val="22"/>
-        </w:rPr>
-        <w:t>Erabiltzaileak bere izena eta altuera (N) sartuko ditu. Programak N lerroko piramide bat marraztuko du, lerro bakoitzean izenaren lehen letra errepikatuz (PARA praktikatzeko piramideen ildotik).</w:t>
-      </w:r>
-    </w:p>
-    <w:p>
-      <w:pPr>
-        <w:spacing w:after="160"/>
-        <w:ind w:left="283"/>
-        <w:shd w:fill="F4F6F8" w:val="clear"/>
-      </w:pPr>
-      <w:r>
-        <w:rPr>
-          <w:rFonts w:ascii="Calibri" w:hAnsi="Calibri"/>
-          <w:b w:val="0"/>
-          <w:i w:val="0"/>
-          <w:color w:val="464646"/>
-          <w:sz w:val="20"/>
-        </w:rPr>
-        <w:t>Adibidea:</w:t>
-        <w:br/>
-        <w:t>Izena: Amaia</w:t>
-        <w:br/>
-        <w:t>Altuera: 4</w:t>
-        <w:br/>
-        <w:br/>
-        <w:t>A</w:t>
-        <w:br/>
-        <w:t>A A</w:t>
-        <w:br/>
-        <w:t>A A A</w:t>
-        <w:br/>
-        <w:t>A A A A</w:t>
-      </w:r>
-    </w:p>
-    <w:p>
-      <w:r>
-        <w:br w:type="page"/>
-      </w:r>
-    </w:p>
-    <w:p>
-      <w:pPr>
-        <w:spacing w:after="120"/>
-        <w:jc w:val="left"/>
-      </w:pPr>
-      <w:r>
-        <w:rPr>
-          <w:rFonts w:ascii="Calibri" w:hAnsi="Calibri"/>
-          <w:b/>
-          <w:i w:val="0"/>
-          <w:color w:val="0D6E6E"/>
-          <w:sz w:val="40"/>
-        </w:rPr>
-        <w:t>Irakaslearentzat – gomendioak</w:t>
-      </w:r>
-    </w:p>
-    <w:p>
-      <w:pPr>
-        <w:spacing w:after="120"/>
-      </w:pPr>
-      <w:r>
-        <w:rPr>
-          <w:rFonts w:ascii="Calibri" w:hAnsi="Calibri"/>
-          <w:b w:val="0"/>
-          <w:i/>
-          <w:color w:val="4A5568"/>
-          <w:sz w:val="20"/>
-        </w:rPr>
-        <w:t>(Ikasleei ez banatu atal hau, nahi izanez gero.)</w:t>
-      </w:r>
-    </w:p>
-    <w:p>
-      <w:pPr>
-        <w:spacing w:before="320" w:after="80"/>
-      </w:pPr>
-      <w:r>
-        <w:rPr>
-          <w:rFonts w:ascii="Calibri" w:hAnsi="Calibri"/>
-          <w:b/>
-          <w:i w:val="0"/>
-          <w:color w:val="1A2332"/>
-          <w:sz w:val="28"/>
-        </w:rPr>
-        <w:t>Zailtasun-eskala</w:t>
-      </w:r>
-    </w:p>
-    <w:p>
-      <w:pPr>
-        <w:pStyle w:val="ListBullet"/>
-      </w:pPr>
-      <w:r>
-        <w:rPr>
-          <w:rFonts w:ascii="Calibri" w:hAnsi="Calibri"/>
-          <w:b w:val="0"/>
-          <w:i w:val="0"/>
-          <w:sz w:val="22"/>
-        </w:rPr>
-        <w:t>Hasiberri: A1, A2, A3, C1, B1</w:t>
-      </w:r>
-    </w:p>
-    <w:p>
-      <w:pPr>
-        <w:pStyle w:val="ListBullet"/>
-      </w:pPr>
-      <w:r>
-        <w:rPr>
-          <w:rFonts w:ascii="Calibri" w:hAnsi="Calibri"/>
-          <w:b w:val="0"/>
-          <w:i w:val="0"/>
-          <w:sz w:val="22"/>
-        </w:rPr>
-        <w:t>Ertaina: A4, B2, B3, B4, C2, C3, C4, D1–D3</w:t>
-      </w:r>
-    </w:p>
-    <w:p>
-      <w:pPr>
-        <w:pStyle w:val="ListBullet"/>
-      </w:pPr>
-      <w:r>
-        <w:rPr>
-          <w:rFonts w:ascii="Calibri" w:hAnsi="Calibri"/>
-          <w:b w:val="0"/>
-          <w:i w:val="0"/>
-          <w:sz w:val="22"/>
-        </w:rPr>
-        <w:t>Aurreratua: D4, D5, E1–E3</w:t>
-      </w:r>
-    </w:p>
-    <w:p>
-      <w:pPr>
-        <w:spacing w:before="320" w:after="80"/>
-      </w:pPr>
-      <w:r>
-        <w:rPr>
-          <w:rFonts w:ascii="Calibri" w:hAnsi="Calibri"/>
-          <w:b/>
-          <w:i w:val="0"/>
-          <w:color w:val="1A2332"/>
-          <w:sz w:val="28"/>
-        </w:rPr>
-        <w:t>Gomendatutako buklea</w:t>
-      </w:r>
-    </w:p>
-    <w:p>
-      <w:pPr>
-        <w:pStyle w:val="ListBullet"/>
-      </w:pPr>
-      <w:r>
-        <w:rPr>
-          <w:rFonts w:ascii="Calibri" w:hAnsi="Calibri"/>
-          <w:b w:val="0"/>
-          <w:i w:val="0"/>
-          <w:sz w:val="22"/>
-        </w:rPr>
-        <w:t>A1–A4 → PARA (Kopurua aldez aurretik ezaguna)</w:t>
-      </w:r>
-    </w:p>
-    <w:p>
-      <w:pPr>
-        <w:pStyle w:val="ListBullet"/>
-      </w:pPr>
-      <w:r>
-        <w:rPr>
-          <w:rFonts w:ascii="Calibri" w:hAnsi="Calibri"/>
-          <w:b w:val="0"/>
-          <w:i w:val="0"/>
-          <w:sz w:val="22"/>
-        </w:rPr>
-        <w:t>A3 → PARA Con Paso -1 (Beherako kontaketa)</w:t>
-      </w:r>
-    </w:p>
-    <w:p>
-      <w:pPr>
-        <w:pStyle w:val="ListBullet"/>
-      </w:pPr>
-      <w:r>
-        <w:rPr>
-          <w:rFonts w:ascii="Calibri" w:hAnsi="Calibri"/>
-          <w:b w:val="0"/>
-          <w:i w:val="0"/>
-          <w:sz w:val="22"/>
-        </w:rPr>
-        <w:t>B1 → MIENTRAS («AMAITU» sentinela)</w:t>
-      </w:r>
-    </w:p>
-    <w:p>
-      <w:pPr>
-        <w:pStyle w:val="ListBullet"/>
-      </w:pPr>
-      <w:r>
-        <w:rPr>
-          <w:rFonts w:ascii="Calibri" w:hAnsi="Calibri"/>
-          <w:b w:val="0"/>
-          <w:i w:val="0"/>
-          <w:sz w:val="22"/>
-        </w:rPr>
-        <w:t>B2 → MIENTRAS (Saldoa ≥ 1,20 bitartean)</w:t>
-      </w:r>
-    </w:p>
-    <w:p>
-      <w:pPr>
-        <w:pStyle w:val="ListBullet"/>
-      </w:pPr>
-      <w:r>
-        <w:rPr>
-          <w:rFonts w:ascii="Calibri" w:hAnsi="Calibri"/>
-          <w:b w:val="0"/>
-          <w:i w:val="0"/>
-          <w:sz w:val="22"/>
-        </w:rPr>
-        <w:t>B3 → MIENTRAS («bai» erantzun bitartean)</w:t>
-      </w:r>
-    </w:p>
-    <w:p>
-      <w:pPr>
-        <w:pStyle w:val="ListBullet"/>
-      </w:pPr>
-      <w:r>
-        <w:rPr>
-          <w:rFonts w:ascii="Calibri" w:hAnsi="Calibri"/>
-          <w:b w:val="0"/>
-          <w:i w:val="0"/>
-          <w:sz w:val="22"/>
-        </w:rPr>
-        <w:t>B4 → MIENTRAS (0 sentinela)</w:t>
-      </w:r>
-    </w:p>
-    <w:p>
-      <w:pPr>
-        <w:pStyle w:val="ListBullet"/>
-      </w:pPr>
-      <w:r>
-        <w:rPr>
-          <w:rFonts w:ascii="Calibri" w:hAnsi="Calibri"/>
-          <w:b w:val="0"/>
-          <w:i w:val="0"/>
-          <w:sz w:val="22"/>
-        </w:rPr>
-        <w:t>C1 → REPETIR (Gutxienez behin; pasahitza zuzena izan arte)</w:t>
-      </w:r>
-    </w:p>
-    <w:p>
-      <w:pPr>
-        <w:pStyle w:val="ListBullet"/>
-      </w:pPr>
-      <w:r>
-        <w:rPr>
-          <w:rFonts w:ascii="Calibri" w:hAnsi="Calibri"/>
-          <w:b w:val="0"/>
-          <w:i w:val="0"/>
-          <w:sz w:val="22"/>
-        </w:rPr>
-        <w:t>C2 → REPETIR (Menua; 0 aukeratu arte)</w:t>
-      </w:r>
-    </w:p>
-    <w:p>
-      <w:pPr>
-        <w:pStyle w:val="ListBullet"/>
-      </w:pPr>
-      <w:r>
-        <w:rPr>
-          <w:rFonts w:ascii="Calibri" w:hAnsi="Calibri"/>
-          <w:b w:val="0"/>
-          <w:i w:val="0"/>
-          <w:sz w:val="22"/>
-        </w:rPr>
-        <w:t>C3–C4 → REPETIR (Balidazioa)</w:t>
-      </w:r>
-    </w:p>
-    <w:p>
-      <w:pPr>
-        <w:pStyle w:val="ListBullet"/>
-      </w:pPr>
-      <w:r>
-        <w:rPr>
-          <w:rFonts w:ascii="Calibri" w:hAnsi="Calibri"/>
-          <w:b w:val="0"/>
-          <w:i w:val="0"/>
-          <w:sz w:val="22"/>
-        </w:rPr>
-        <w:t>D1 → MIENTRAS («GABE» sentinela)</w:t>
-      </w:r>
-    </w:p>
-    <w:p>
-      <w:pPr>
-        <w:pStyle w:val="ListBullet"/>
-      </w:pPr>
-      <w:r>
-        <w:rPr>
-          <w:rFonts w:ascii="Calibri" w:hAnsi="Calibri"/>
-          <w:b w:val="0"/>
-          <w:i w:val="0"/>
-          <w:sz w:val="22"/>
-        </w:rPr>
-        <w:t>D2 → PARA (11 jokalari finko)</w:t>
-      </w:r>
-    </w:p>
-    <w:p>
-      <w:pPr>
-        <w:pStyle w:val="ListBullet"/>
-      </w:pPr>
-      <w:r>
-        <w:rPr>
-          <w:rFonts w:ascii="Calibri" w:hAnsi="Calibri"/>
-          <w:b w:val="0"/>
-          <w:i w:val="0"/>
-          <w:sz w:val="22"/>
-        </w:rPr>
-        <w:t>D3 → MIENTRAS (80 € lortu arte)</w:t>
-      </w:r>
-    </w:p>
-    <w:p>
-      <w:pPr>
-        <w:pStyle w:val="ListBullet"/>
-      </w:pPr>
-      <w:r>
-        <w:rPr>
-          <w:rFonts w:ascii="Calibri" w:hAnsi="Calibri"/>
-          <w:b w:val="0"/>
-          <w:i w:val="0"/>
-          <w:sz w:val="22"/>
-        </w:rPr>
-        <w:t>D4 → MIENTRAS edo REPETIR (Paperik dagoen bitartean)</w:t>
-      </w:r>
-    </w:p>
-    <w:p>
-      <w:pPr>
-        <w:pStyle w:val="ListBullet"/>
-      </w:pPr>
-      <w:r>
-        <w:rPr>
-          <w:rFonts w:ascii="Calibri" w:hAnsi="Calibri"/>
-          <w:b w:val="0"/>
-          <w:i w:val="0"/>
-          <w:sz w:val="22"/>
-        </w:rPr>
-        <w:t>D5 → PARA (1etik 20ra)</w:t>
-      </w:r>
-    </w:p>
-    <w:p>
-      <w:pPr>
-        <w:pStyle w:val="ListBullet"/>
-      </w:pPr>
-      <w:r>
-        <w:rPr>
-          <w:rFonts w:ascii="Calibri" w:hAnsi="Calibri"/>
-          <w:b w:val="0"/>
-          <w:i w:val="0"/>
-          <w:sz w:val="22"/>
-        </w:rPr>
-        <w:t>E1 → PARA habiaratua (Egunak × orduak)</w:t>
-      </w:r>
-    </w:p>
-    <w:p>
-      <w:pPr>
-        <w:pStyle w:val="ListBullet"/>
-      </w:pPr>
-      <w:r>
-        <w:rPr>
-          <w:rFonts w:ascii="Calibri" w:hAnsi="Calibri"/>
-          <w:b w:val="0"/>
-          <w:i w:val="0"/>
-          <w:sz w:val="22"/>
-        </w:rPr>
-        <w:t>E2 → REPETIR + kontagailua (Saiakerak ≤ 3)</w:t>
-      </w:r>
-    </w:p>
-    <w:p>
-      <w:pPr>
-        <w:pStyle w:val="ListBullet"/>
-      </w:pPr>
-      <w:r>
-        <w:rPr>
-          <w:rFonts w:ascii="Calibri" w:hAnsi="Calibri"/>
-          <w:b w:val="0"/>
-          <w:i w:val="0"/>
-          <w:sz w:val="22"/>
-        </w:rPr>
-        <w:t>E3 → PARA habiaratua (Piramidea)</w:t>
-      </w:r>
-    </w:p>
-    <w:p>
-      <w:pPr>
-        <w:spacing w:before="320" w:after="80"/>
-      </w:pPr>
-      <w:r>
-        <w:rPr>
-          <w:rFonts w:ascii="Calibri" w:hAnsi="Calibri"/>
-          <w:b/>
-          <w:i w:val="0"/>
-          <w:color w:val="1A2332"/>
-          <w:sz w:val="28"/>
-        </w:rPr>
-        <w:t>Saioetarako proposamena</w:t>
-      </w:r>
-    </w:p>
-    <w:p>
-      <w:pPr>
-        <w:pStyle w:val="ListBullet"/>
-      </w:pPr>
-      <w:r>
-        <w:rPr>
-          <w:rFonts w:ascii="Calibri" w:hAnsi="Calibri"/>
-          <w:b w:val="0"/>
-          <w:i w:val="0"/>
-          <w:sz w:val="22"/>
-        </w:rPr>
-        <w:t>Saio 1: A1, A2, A3 + B1 → PARA vs MIENTRAS.</w:t>
-      </w:r>
-    </w:p>
-    <w:p>
-      <w:pPr>
-        <w:pStyle w:val="ListBullet"/>
-      </w:pPr>
-      <w:r>
-        <w:rPr>
-          <w:rFonts w:ascii="Calibri" w:hAnsi="Calibri"/>
-          <w:b w:val="0"/>
-          <w:i w:val="0"/>
-          <w:sz w:val="22"/>
-        </w:rPr>
-        <w:t>Saio 2: C1, C2, C3 → REPETIR (balidazioa / menua).</w:t>
-      </w:r>
-    </w:p>
-    <w:p>
-      <w:pPr>
-        <w:pStyle w:val="ListBullet"/>
-      </w:pPr>
-      <w:r>
-        <w:rPr>
-          <w:rFonts w:ascii="Calibri" w:hAnsi="Calibri"/>
-          <w:b w:val="0"/>
-          <w:i w:val="0"/>
-          <w:sz w:val="22"/>
-        </w:rPr>
-        <w:t>Saio 3: B2, B4, D2, D3 → «zein aukeratuko zenuke?»</w:t>
-      </w:r>
-    </w:p>
-    <w:p>
-      <w:pPr>
-        <w:pStyle w:val="ListBullet"/>
-      </w:pPr>
-      <w:r>
-        <w:rPr>
-          <w:rFonts w:ascii="Calibri" w:hAnsi="Calibri"/>
-          <w:b w:val="0"/>
-          <w:i w:val="0"/>
-          <w:sz w:val="22"/>
-        </w:rPr>
-        <w:t>Saio 4 (erronka): E1 edo E2; nahi izanez gero E3.</w:t>
+        <w:t>C1 bezala, baina gehienez 3 saiakera daude. Asmatzen badu: «Ongi etorri!». 3 aldiz huts egiten badu: «Blokeatuta. Joan irakaslearengana.».</w:t>
       </w:r>
     </w:p>
     <w:sectPr>
-      <w:pgSz w:w="12240" w:h="15840"/>
-      <w:pgMar w:top="1134" w:right="1247" w:bottom="1134" w:left="1247" w:header="720" w:footer="720" w:gutter="0"/>
+      <w:pgSz w:w="16838" w:h="11906" w:orient="landscape"/>
+      <w:pgMar w:top="680" w:right="794" w:bottom="680" w:left="794" w:header="720" w:footer="720" w:gutter="0"/>
       <w:cols w:space="720"/>
       <w:docGrid w:linePitch="360"/>
     </w:sectPr>
@@ -2578,8 +1044,8 @@
     <w:qFormat/>
     <w:rsid w:val="00FC693F"/>
     <w:rPr>
-      <w:rFonts w:ascii="Calibri" w:hAnsi="Calibri" w:eastAsia="Calibri"/>
-      <w:sz w:val="22"/>
+      <w:rFonts w:ascii="Calibri" w:hAnsi="Calibri"/>
+      <w:sz w:val="20"/>
     </w:rPr>
   </w:style>
   <w:style w:type="paragraph" w:styleId="Header">

</xml_diff>